<commit_message>
docs: Regenerate UML diagrams and publish SAD/STP reports as PDF
- Rebuild all three UML diagrams (component + 2 sequence) in plain black
  and white, fixing label/lifeline collisions, malformed self-messages,
  crossing dependency arrows and excess whitespace in the previous render.
- Re-embed the corrected diagrams into the SAD Word report.
- Add Team11_SAD_Report.pdf (16 pp) and Team11_STP_Report.pdf (9 pp),
  with UML figures placed on landscape pages for legibility.
</commit_message>
<xml_diff>
--- a/Team11_SAD_Report.docx
+++ b/Team11_SAD_Report.docx
@@ -2205,7 +2205,7 @@
       <w:r>
         <w:drawing>
           <wp:inline xmlns:a="http://schemas.openxmlformats.org/drawingml/2006/main" xmlns:pic="http://schemas.openxmlformats.org/drawingml/2006/picture">
-            <wp:extent cx="5486400" cy="3794528"/>
+            <wp:extent cx="5486400" cy="3610883"/>
             <wp:docPr id="1" name="Picture 1"/>
             <wp:cNvGraphicFramePr>
               <a:graphicFrameLocks noChangeAspect="1"/>
@@ -2226,7 +2226,7 @@
                   <pic:spPr>
                     <a:xfrm>
                       <a:off x="0" y="0"/>
-                      <a:ext cx="5486400" cy="3794528"/>
+                      <a:ext cx="5486400" cy="3610883"/>
                     </a:xfrm>
                     <a:prstGeom prst="rect"/>
                   </pic:spPr>
@@ -6341,7 +6341,7 @@
       <w:r>
         <w:drawing>
           <wp:inline xmlns:a="http://schemas.openxmlformats.org/drawingml/2006/main" xmlns:pic="http://schemas.openxmlformats.org/drawingml/2006/picture">
-            <wp:extent cx="5486400" cy="4132162"/>
+            <wp:extent cx="5486400" cy="4314632"/>
             <wp:docPr id="2" name="Picture 2"/>
             <wp:cNvGraphicFramePr>
               <a:graphicFrameLocks noChangeAspect="1"/>
@@ -6362,7 +6362,7 @@
                   <pic:spPr>
                     <a:xfrm>
                       <a:off x="0" y="0"/>
-                      <a:ext cx="5486400" cy="4132162"/>
+                      <a:ext cx="5486400" cy="4314632"/>
                     </a:xfrm>
                     <a:prstGeom prst="rect"/>
                   </pic:spPr>
@@ -6417,7 +6417,7 @@
       <w:r>
         <w:drawing>
           <wp:inline xmlns:a="http://schemas.openxmlformats.org/drawingml/2006/main" xmlns:pic="http://schemas.openxmlformats.org/drawingml/2006/picture">
-            <wp:extent cx="5486400" cy="3866137"/>
+            <wp:extent cx="5486400" cy="4698437"/>
             <wp:docPr id="3" name="Picture 3"/>
             <wp:cNvGraphicFramePr>
               <a:graphicFrameLocks noChangeAspect="1"/>
@@ -6438,7 +6438,7 @@
                   <pic:spPr>
                     <a:xfrm>
                       <a:off x="0" y="0"/>
-                      <a:ext cx="5486400" cy="3866137"/>
+                      <a:ext cx="5486400" cy="4698437"/>
                     </a:xfrm>
                     <a:prstGeom prst="rect"/>
                   </pic:spPr>

</xml_diff>

<commit_message>
docs: Leave the course coordinator signature line blank in SAD and STP
The approval tables recorded "Approved / 15-09-2026" against the Course
Coordinator in both documents, asserting a faculty sign-off that has not
happened. That row is now an empty signature line, which is how a document
goes out for review: authors sign, approvers' lines stay blank until signed.

Also replaces "Approved" with the actual signatory names in the STP's QA Lead
and Test Architect rows, so those cells read as genuine self-attestations
rather than a generic approval stamp.

Applied to the Markdown sources and regenerated both Word and PDF reports.
</commit_message>
<xml_diff>
--- a/Team11_SAD_Report.docx
+++ b/Team11_SAD_Report.docx
@@ -915,13 +915,14 @@
             <w:tcW w:type="dxa" w:w="2340"/>
           </w:tcPr>
           <w:p>
-            <w:r/>
-            <w:r>
-              <w:rPr>
-                <w:rFonts w:ascii="Times New Roman" w:hAnsi="Times New Roman"/>
-                <w:sz w:val="15"/>
-              </w:rPr>
-              <w:t>Approved / 15-09-2026</w:t>
+            <w:r>
+              <w:t>________________ / __________</w:t>
+            </w:r>
+            <w:r>
+              <w:rPr>
+                <w:rFonts w:ascii="Times New Roman" w:hAnsi="Times New Roman"/>
+                <w:sz w:val="15"/>
+              </w:rPr>
             </w:r>
           </w:p>
         </w:tc>

</xml_diff>